<commit_message>
docx: port Bab III (metodologi umum)
- preprocess: split align env into stacked equations (nesting-aware so
  cases/& survive), {\rm x} -> {\mathrm{x}}, strip \textcolor inside math
  (texmath rejects it), unwrap \emph/\textit inside math
- restyle: Heading2/3 forced flush-left (template centers Heading3,
  contradicting juknis); bab1/2/6 rebuilt with the patch

Co-Authored-By: Claude Fable 5 <noreply@anthropic.com>
</commit_message>
<xml_diff>
--- a/dissertation-docx/chapters/bab1.docx
+++ b/dissertation-docx/chapters/bab1.docx
@@ -11836,7 +11836,7 @@
         <w:numId w:val="2"/>
       </w:numPr>
       <w:spacing w:after="0" w:line="360" w:lineRule="auto"/>
-      <w:jc w:val="both"/>
+      <w:jc w:val="left"/>
       <w:outlineLvl w:val="1"/>
     </w:pPr>
     <w:rPr>
@@ -11862,7 +11862,7 @@
         <w:numId w:val="2"/>
       </w:numPr>
       <w:spacing w:after="0" w:line="360" w:lineRule="auto"/>
-      <w:jc w:val="center"/>
+      <w:jc w:val="left"/>
       <w:outlineLvl w:val="2"/>
     </w:pPr>
     <w:rPr>

</xml_diff>